<commit_message>
feat: export complete Athena analytical query results and 156 raw records to CSV via AWS CLI script
</commit_message>
<xml_diff>
--- a/docs/Bao_cao_tuan_1_Dien_toan_dam_may_Nhom_05.docx
+++ b/docs/Bao_cao_tuan_1_Dien_toan_dam_may_Nhom_05.docx
@@ -879,7 +879,7 @@
         </w:rPr>
         <w:t>Chương 5 Tổng hợp kết quả và chi phí Tuần 1</w:t>
         <w:tab/>
-        <w:t>17</w:t>
+        <w:t>16</w:t>
       </w:r>
     </w:p>
     <w:p>
@@ -897,7 +897,7 @@
         </w:rPr>
         <w:t>5.1 Mức độ hoàn thành theo sản phẩm</w:t>
         <w:tab/>
-        <w:t>17</w:t>
+        <w:t>16</w:t>
       </w:r>
     </w:p>
     <w:p>
@@ -915,7 +915,7 @@
         </w:rPr>
         <w:t>5.2 Quản lý chi phí</w:t>
         <w:tab/>
-        <w:t>17</w:t>
+        <w:t>16</w:t>
       </w:r>
     </w:p>
     <w:p>
@@ -933,7 +933,7 @@
         </w:rPr>
         <w:t>5.3 Kết luận</w:t>
         <w:tab/>
-        <w:t>18</w:t>
+        <w:t>16</w:t>
       </w:r>
     </w:p>
     <w:p>
@@ -12851,7 +12851,7 @@
         <w:pStyle w:val="BodyText"/>
       </w:pPr>
       <w:r>
-        <w:t>Trong Tuần 1, hệ thống AWS Lab có dữ liệu quan sát, bốn truy vấn Athena thành công và bốn biểu đồ từ CSV. Đây là các kết quả của tập dữ liệu và các lượt đo đã nêu; phân công của chúng em được trình bày ở Bảng 2.1. AI hỗ trợ tra cứu, biên tập và dàn trang bản Word/PDF; số liệu báo cáo được tổng hợp từ mã nguồn, CSV và kết quả quan sát AWS nêu trên.</w:t>
+        <w:t>Trong Tuần 1, lượt xuất Athena có 156 bản ghi, bốn truy vấn thành công và bốn biểu đồ từ CSV. Phân công của chúng em được trình bày ở Bảng 2.1. AI hỗ trợ tra cứu, biên tập và dàn trang; số liệu được tổng hợp từ CSV và các kết quả quan sát AWS nêu trên.</w:t>
       </w:r>
     </w:p>
     <w:sectPr>

</xml_diff>

<commit_message>
fix(sync): synchronize all code, scripts, DDL, and docs to active Learner Lab account 134987931868
</commit_message>
<xml_diff>
--- a/docs/Bao_cao_tuan_1_Dien_toan_dam_may_Nhom_05.docx
+++ b/docs/Bao_cao_tuan_1_Dien_toan_dam_may_Nhom_05.docx
@@ -364,7 +364,7 @@
         <w:pStyle w:val="BodyText"/>
       </w:pPr>
       <w:r>
-        <w:t>Trong Tuần 1, Lambda ở trạng thái Active, lịch EventBridge đang Enabled, S3 có bảy đối tượng raw và Glue có ba phân vùng dữ liệu. Bốn truy vấn Athena đều SUCCEEDED; tập dữ liệu xuất có 156 bản ghi, 52 bản ghi cho mỗi thành phố và mỗi truy vấn quét 87.551 byte. Báo cáo trình bày bốn biểu đồ dựng từ CSV Athena, đủ 24 nhóm giờ UTC, phân bố AQI và tương quan khí tượng.</w:t>
+        <w:t>Trong Tuần 1, Lambda ở trạng thái Active, lịch EventBridge đang Enabled, S3 có ba đối tượng raw với tổng 87.250 byte và Glue có ba phân vùng dữ liệu. Năm truy vấn Athena đều SUCCEEDED, gồm bốn truy vấn phân tích và một truy vấn xuất 156 bản ghi gốc; mỗi truy vấn quét 87.250 byte. Báo cáo trình bày bốn biểu đồ từ CSV, 24 nhóm giờ UTC, phân bố AQI và tương quan khí tượng.</w:t>
       </w:r>
     </w:p>
     <w:p>
@@ -858,7 +858,7 @@
         <w:rPr>
           <w:sz w:val="22"/>
         </w:rPr>
-        <w:t>4.6 Thời gian và dung lượng quét của bốn truy vấn</w:t>
+        <w:t>4.6 Thời gian và dung lượng quét của năm truy vấn</w:t>
         <w:tab/>
         <w:t>15</w:t>
       </w:r>
@@ -1171,7 +1171,7 @@
                 <w:rFonts w:ascii="Times New Roman" w:hAnsi="Times New Roman"/>
                 <w:sz w:val="20"/>
               </w:rPr>
-              <w:t>EventBridge rate(1 hour); Lambda xử lý ba đô thị; sáu lượt gọi ghi nhận</w:t>
+              <w:t>EventBridge rate(1 hour); Lambda xử lý ba đô thị; bốn lượt gọi ghi nhận</w:t>
             </w:r>
           </w:p>
         </w:tc>
@@ -1248,7 +1248,7 @@
                 <w:rFonts w:ascii="Times New Roman" w:hAnsi="Times New Roman"/>
                 <w:sz w:val="20"/>
               </w:rPr>
-              <w:t>NDJSON phân vùng year/month/day; 7 tệp raw, 89.267 byte</w:t>
+              <w:t>NDJSON phân vùng year/month/day; 3 tệp raw, 87.250 byte</w:t>
             </w:r>
           </w:p>
         </w:tc>
@@ -1402,7 +1402,7 @@
                 <w:rFonts w:ascii="Times New Roman" w:hAnsi="Times New Roman"/>
                 <w:sz w:val="20"/>
               </w:rPr>
-              <w:t>Glue có ba phân vùng; Athena có 4/4 truy vấn thành công và 156 dòng ở lượt xuất</w:t>
+              <w:t>Glue có ba phân vùng; Athena có 5/5 truy vấn thành công, 156 dòng gốc</w:t>
             </w:r>
           </w:p>
         </w:tc>
@@ -1479,7 +1479,7 @@
                 <w:rFonts w:ascii="Times New Roman" w:hAnsi="Times New Roman"/>
                 <w:sz w:val="20"/>
               </w:rPr>
-              <w:t>10 MessageId Publish; CloudWatch Alarm ở trạng thái INSUFFICIENT_DATA</w:t>
+              <w:t>6 MessageId trong log; CloudWatch Alarm ở trạng thái INSUFFICIENT_DATA</w:t>
             </w:r>
           </w:p>
         </w:tc>
@@ -1670,7 +1670,7 @@
         <w:pStyle w:val="BodyText"/>
       </w:pPr>
       <w:r>
-        <w:t>Các bảng phân tích sử dụng bốn tệp CSV và tệp metrics xuất từ Athena trong Tuần 1. Số liệu S3, log Lambda và CloudWatch được ghi nhận ở các lượt quan sát khác nhau. Vì vậy báo cáo ghi riêng số dòng ở lượt xuất Athena và số dòng theo log về sau.</w:t>
+        <w:t>Các bảng phân tích sử dụng bốn CSV tổng hợp, CSV chứa 156 bản ghi gốc và bảng chỉ số truy vấn đã lưu trong Tuần 1. Số liệu S3, Lambda và CloudWatch được đọc ở các mốc quan sát riêng. Báo cáo đối chiếu độc lập số dòng giữa bảng đô thị, bảng giờ, bảng cấp AQI và dữ liệu gốc.</w:t>
       </w:r>
     </w:p>
     <w:p>
@@ -1827,7 +1827,7 @@
                 <w:rFonts w:ascii="Times New Roman" w:hAnsi="Times New Roman"/>
                 <w:sz w:val="20"/>
               </w:rPr>
-              <w:t>156 dòng, bốn truy vấn, thời gian và byte quét</w:t>
+              <w:t>156 dòng gốc, năm truy vấn, thời gian và byte quét</w:t>
             </w:r>
           </w:p>
         </w:tc>
@@ -1904,7 +1904,7 @@
                 <w:rFonts w:ascii="Times New Roman" w:hAnsi="Times New Roman"/>
                 <w:sz w:val="20"/>
               </w:rPr>
-              <w:t>7 tệp raw, tổng 89.267 byte</w:t>
+              <w:t>3 tệp raw, tổng 87.250 byte</w:t>
             </w:r>
           </w:p>
         </w:tc>
@@ -1981,7 +1981,7 @@
                 <w:rFonts w:ascii="Times New Roman" w:hAnsi="Times New Roman"/>
                 <w:sz w:val="20"/>
               </w:rPr>
-              <w:t>6 lượt gọi, 144 + 15 dòng theo log, 10 MessageId</w:t>
+              <w:t>4 lượt gọi, 0 lỗi, 6 MessageId trong log</w:t>
             </w:r>
           </w:p>
         </w:tc>
@@ -2348,7 +2348,7 @@
                 <w:rFonts w:ascii="Times New Roman" w:hAnsi="Times New Roman"/>
                 <w:sz w:val="20"/>
               </w:rPr>
-              <w:t>Log có một lượt nạp 144 dòng và năm lượt realtime; S3 có 7 tệp raw</w:t>
+              <w:t>S3 có 3 tệp raw, 87.250 byte; CSV gốc có 156 dòng</w:t>
             </w:r>
           </w:p>
         </w:tc>
@@ -2425,7 +2425,7 @@
                 <w:rFonts w:ascii="Times New Roman" w:hAnsi="Times New Roman"/>
                 <w:sz w:val="20"/>
               </w:rPr>
-              <w:t>20 cột, 3 phân vùng; 4 truy vấn SUCCEEDED, lượt xuất 156 dòng</w:t>
+              <w:t>20 cột, 3 phân vùng; 5 truy vấn SUCCEEDED, 156 dòng gốc</w:t>
             </w:r>
           </w:p>
         </w:tc>
@@ -2502,7 +2502,7 @@
                 <w:rFonts w:ascii="Times New Roman" w:hAnsi="Times New Roman"/>
                 <w:sz w:val="20"/>
               </w:rPr>
-              <w:t>10 Publish được AWS chấp nhận; chưa xác nhận email đến, Alarm còn INSUFFICIENT_DATA</w:t>
+              <w:t>6 MessageId trong log; chưa xác nhận email đến, Alarm còn INSUFFICIENT_DATA</w:t>
             </w:r>
           </w:p>
         </w:tc>
@@ -2719,7 +2719,7 @@
                 <w:rFonts w:ascii="Times New Roman" w:hAnsi="Times New Roman"/>
                 <w:sz w:val="20"/>
               </w:rPr>
-              <w:t>Bucket và Secret; Lambda Active; 7 tệp raw; 10 MessageId SNS</w:t>
+              <w:t>Bucket và Secret; Lambda Active; 3 tệp raw; 6 MessageId trong log</w:t>
             </w:r>
           </w:p>
         </w:tc>
@@ -2796,7 +2796,7 @@
                 <w:rFonts w:ascii="Times New Roman" w:hAnsi="Times New Roman"/>
                 <w:sz w:val="20"/>
               </w:rPr>
-              <w:t>3 phân vùng Glue; 4 truy vấn Athena; 4 biểu đồ dữ liệu</w:t>
+              <w:t>3 phân vùng Glue; 5 truy vấn Athena; 4 biểu đồ dữ liệu</w:t>
             </w:r>
           </w:p>
         </w:tc>
@@ -3216,7 +3216,7 @@
                 <w:rFonts w:ascii="Times New Roman" w:hAnsi="Times New Roman"/>
                 <w:sz w:val="20"/>
               </w:rPr>
-              <w:t>48 giờ lịch sử và các lượt realtime</w:t>
+              <w:t>Ba phân vùng UTC của tập quan trắc</w:t>
             </w:r>
           </w:p>
         </w:tc>
@@ -3256,7 +3256,7 @@
         <w:pStyle w:val="BodyText"/>
       </w:pPr>
       <w:r>
-        <w:t>Tập dữ liệu xuất trong Tuần 1 có 156 dòng, gồm 144 dòng lịch sử và 12 dòng realtime. Các phép tổng hợp theo đô thị, giờ, cấp AQI và tương quan đều được thực hiện trên tập dữ liệu này, bảo đảm bốn góc nhìn dùng cùng số mẫu.</w:t>
+        <w:t>Tập dữ liệu xuất trong Tuần 1 có 156 dòng: 52 dòng cho mỗi đô thị và lần lượt 72, 72, 12 dòng ở ba phân vùng UTC. Các phép tổng hợp theo đô thị, giờ và cấp AQI đều cộng về 156. Phân tích tương quan sử dụng cùng tập dữ liệu này theo từng đô thị.</w:t>
       </w:r>
     </w:p>
     <w:p>
@@ -3421,7 +3421,7 @@
                 <w:rFonts w:ascii="Times New Roman" w:hAnsi="Times New Roman"/>
                 <w:sz w:val="20"/>
               </w:rPr>
-              <w:t>7 tệp raw, 89.267 byte; 1 Secret cấu hình</w:t>
+              <w:t>3 tệp raw, 87.250 byte; 1 Secret cấu hình</w:t>
             </w:r>
           </w:p>
         </w:tc>
@@ -3498,7 +3498,7 @@
                 <w:rFonts w:ascii="Times New Roman" w:hAnsi="Times New Roman"/>
                 <w:sz w:val="20"/>
               </w:rPr>
-              <w:t>Lambda Active; Rule Enabled; 6 lượt gọi</w:t>
+              <w:t>Lambda Active; Rule Enabled; 4 lượt gọi, 0 lỗi</w:t>
             </w:r>
           </w:p>
         </w:tc>
@@ -3575,7 +3575,7 @@
                 <w:rFonts w:ascii="Times New Roman" w:hAnsi="Times New Roman"/>
                 <w:sz w:val="20"/>
               </w:rPr>
-              <w:t>144 dòng backfill; 5 lượt realtime × 3 dòng; 10 MessageId</w:t>
+              <w:t>6 MessageId riêng biệt trong log</w:t>
             </w:r>
           </w:p>
         </w:tc>
@@ -3599,7 +3599,7 @@
                 <w:rFonts w:ascii="Times New Roman" w:hAnsi="Times New Roman"/>
                 <w:sz w:val="20"/>
               </w:rPr>
-              <w:t>CloudWatch Logs; Publish không chứng minh email đã tới</w:t>
+              <w:t>Publish không chứng minh email đã tới</w:t>
             </w:r>
           </w:p>
         </w:tc>
@@ -3652,7 +3652,7 @@
                 <w:rFonts w:ascii="Times New Roman" w:hAnsi="Times New Roman"/>
                 <w:sz w:val="20"/>
               </w:rPr>
-              <w:t>3 phân vùng dữ liệu; 4/4 truy vấn SUCCEEDED; 87.551 byte/truy vấn</w:t>
+              <w:t>3 phân vùng dữ liệu; 5/5 truy vấn SUCCEEDED; 87.250 byte/truy vấn</w:t>
             </w:r>
           </w:p>
         </w:tc>
@@ -3769,7 +3769,7 @@
         <w:pStyle w:val="BodyText"/>
       </w:pPr>
       <w:r>
-        <w:t>Lượt xuất Athena trong Tuần 1 có 156 dòng: 144 dòng nạp lịch sử (48 giờ × 3 đô thị) cộng bốn lượt realtime, mỗi lượt ba dòng. Log của lượt realtime thứ năm nâng tổng dòng được báo đã ghi lên 159 ở mốc sau đó. Hai con số khác nhau vì thời điểm quan sát khác nhau. Bốn truy vấn theo đô thị, giờ UTC, cấp AQI và tương quan khí tượng đều hoàn thành; Chương 4 phân tích chi tiết các bảng và biểu đồ từ CSV của lượt xuất này.</w:t>
+        <w:t>Lượt xuất Athena trong Tuần 1 có 156 dòng gốc và bốn bảng phân tích. Năm truy vấn gồm so sánh đô thị, nhóm giờ UTC, phân bố cấp AQI, tương quan khí tượng và xuất bản ghi gốc đều hoàn thành. Số dòng theo ba góc nhìn tổng hợp đều khớp dữ liệu gốc; Chương 4 trình bày chi tiết từng bảng và bốn biểu đồ từ CSV của lượt xuất này.</w:t>
       </w:r>
     </w:p>
     <w:p>
@@ -4020,7 +4020,7 @@
                 <w:rFonts w:ascii="Times New Roman" w:hAnsi="Times New Roman"/>
                 <w:sz w:val="20"/>
               </w:rPr>
-              <w:t>WeatherCollectionSchedule, rate(1 hour)</w:t>
+              <w:t>WeatherCollectionHourlyRule, rate(1 hour)</w:t>
             </w:r>
           </w:p>
         </w:tc>
@@ -4097,7 +4097,7 @@
                 <w:rFonts w:ascii="Times New Roman" w:hAnsi="Times New Roman"/>
                 <w:sz w:val="20"/>
               </w:rPr>
-              <w:t>weather-aqi-873674852386/raw</w:t>
+              <w:t>weather-aqi-134987931868/raw</w:t>
             </w:r>
           </w:p>
         </w:tc>
@@ -4405,7 +4405,7 @@
                 <w:rFonts w:ascii="Times New Roman" w:hAnsi="Times New Roman"/>
                 <w:sz w:val="20"/>
               </w:rPr>
-              <w:t>Bốn câu truy vấn phân tích</w:t>
+              <w:t>Bốn truy vấn phân tích và một truy vấn raw</w:t>
             </w:r>
           </w:p>
         </w:tc>
@@ -4562,7 +4562,7 @@
                 <w:rFonts w:ascii="Consolas" w:hAnsi="Consolas"/>
                 <w:sz w:val="18"/>
               </w:rPr>
-              <w:t>s3://weather-aqi-873674852386/raw/</w:t>
+              <w:t>s3://weather-aqi-134987931868/raw/</w:t>
             </w:r>
             <w:r>
               <w:br/>
@@ -5458,7 +5458,7 @@
         <w:pStyle w:val="BodyText"/>
       </w:pPr>
       <w:r>
-        <w:t>Nguồn định lượng của chương này là bốn tệp CSV và summary_metrics.json xuất từ Athena trong Tuần 1. Bốn truy vấn đều có trạng thái SUCCEEDED. Số liệu S3, Lambda, SNS, Glue và CloudWatch trong Bảng 4.1 mang mốc quan sát riêng; vì vậy không được cộng gộp như một phép đo đồng thời với tập CSV Athena.</w:t>
+        <w:t>Nguồn định lượng của chương này là bốn CSV tổng hợp, CSV gốc 156 dòng và bảng metrics của năm truy vấn Athena trong Tuần 1. Cả năm truy vấn có trạng thái SUCCEEDED. Các giá trị vận hành S3, Lambda, SNS, Glue và CloudWatch trong Bảng 4.1 được quan sát riêng; bảng phân tích dùng cùng một tập CSV đã lưu.</w:t>
       </w:r>
     </w:p>
     <w:p>
@@ -5615,7 +5615,7 @@
                 <w:rFonts w:ascii="Times New Roman" w:hAnsi="Times New Roman"/>
                 <w:sz w:val="20"/>
               </w:rPr>
-              <w:t>7 tệp raw; tổng 89.267 byte</w:t>
+              <w:t>3 tệp raw; tổng 87.250 byte</w:t>
             </w:r>
           </w:p>
         </w:tc>
@@ -5639,7 +5639,7 @@
                 <w:rFonts w:ascii="Times New Roman" w:hAnsi="Times New Roman"/>
                 <w:sz w:val="20"/>
               </w:rPr>
-              <w:t>Hai tệp lịch sử và năm tệp realtime</w:t>
+              <w:t>Ba tệp ở ba phân vùng UTC</w:t>
             </w:r>
           </w:p>
         </w:tc>
@@ -5692,7 +5692,7 @@
                 <w:rFonts w:ascii="Times New Roman" w:hAnsi="Times New Roman"/>
                 <w:sz w:val="20"/>
               </w:rPr>
-              <w:t>6 lượt gọi</w:t>
+              <w:t>4 lượt gọi, 0 lỗi</w:t>
             </w:r>
           </w:p>
         </w:tc>
@@ -5716,7 +5716,7 @@
                 <w:rFonts w:ascii="Times New Roman" w:hAnsi="Times New Roman"/>
                 <w:sz w:val="20"/>
               </w:rPr>
-              <w:t>CloudWatch Invocations: 5 lượt trong giờ 22 và 1 lượt trong giờ 23 (UTC+7)</w:t>
+              <w:t>CloudWatch Invocations và Errors trong Tuần 1</w:t>
             </w:r>
           </w:p>
         </w:tc>
@@ -5769,7 +5769,7 @@
                 <w:rFonts w:ascii="Times New Roman" w:hAnsi="Times New Roman"/>
                 <w:sz w:val="20"/>
               </w:rPr>
-              <w:t>144 dòng lịch sử; 5 × 3 dòng realtime</w:t>
+              <w:t>6 MessageId riêng biệt</w:t>
             </w:r>
           </w:p>
         </w:tc>
@@ -5793,7 +5793,7 @@
                 <w:rFonts w:ascii="Times New Roman" w:hAnsi="Times New Roman"/>
                 <w:sz w:val="20"/>
               </w:rPr>
-              <w:t>Sáu kết quả Lambda thành công; số dòng ghi theo log là 159</w:t>
+              <w:t>Chứng minh Publish được chấp nhận; chưa chứng minh email tới</w:t>
             </w:r>
           </w:p>
         </w:tc>
@@ -5846,7 +5846,7 @@
                 <w:rFonts w:ascii="Times New Roman" w:hAnsi="Times New Roman"/>
                 <w:sz w:val="20"/>
               </w:rPr>
-              <w:t>10 MessageId gửi thành công</w:t>
+              <w:t>6 thông điệp được ghi trong log</w:t>
             </w:r>
           </w:p>
         </w:tc>
@@ -5870,7 +5870,7 @@
                 <w:rFonts w:ascii="Times New Roman" w:hAnsi="Times New Roman"/>
                 <w:sz w:val="20"/>
               </w:rPr>
-              <w:t>Log của năm lượt realtime; chưa chứng minh email đã đến hộp thư</w:t>
+              <w:t>Không đồng nhất với số email giao thành công</w:t>
             </w:r>
           </w:p>
         </w:tc>
@@ -6000,7 +6000,7 @@
                 <w:rFonts w:ascii="Times New Roman" w:hAnsi="Times New Roman"/>
                 <w:sz w:val="20"/>
               </w:rPr>
-              <w:t>4/4 truy vấn SUCCEEDED</w:t>
+              <w:t>5/5 truy vấn SUCCEEDED</w:t>
             </w:r>
           </w:p>
         </w:tc>
@@ -6024,7 +6024,7 @@
                 <w:rFonts w:ascii="Times New Roman" w:hAnsi="Times New Roman"/>
                 <w:sz w:val="20"/>
               </w:rPr>
-              <w:t>Mỗi truy vấn quét 87.551 byte; lượt xuất Tuần 1</w:t>
+              <w:t>Mỗi truy vấn quét 87.250 byte; gồm một truy vấn raw</w:t>
             </w:r>
           </w:p>
         </w:tc>
@@ -6040,7 +6040,7 @@
         <w:pStyle w:val="BodyText"/>
       </w:pPr>
       <w:r>
-        <w:t>Ảnh chụp Athena ghi 156 dòng (52 dòng/thành phố). Log Lambda về sau có thêm một lượt realtime ba dòng, nên tổng số dòng được báo đã ghi lên S3 đạt 159 ở mốc muộn hơn. Hai con số khác nhau do thời điểm quan sát khác nhau, không phải sai lệch phép cộng.</w:t>
+        <w:t>CSV gốc có 156 dòng, đúng bằng 52 dòng cho mỗi đô thị. S3 có ba đối tượng raw ở ba phân vùng và tổng dung lượng 87.250 byte; đây cũng là lượng dữ liệu được mỗi truy vấn Athena quét trong lượt xuất quan sát. Hai đại lượng cùng giá trị tại mốc này nhưng mang ý nghĩa khác nhau: kích thước đối tượng và bytes scanned.</w:t>
       </w:r>
     </w:p>
     <w:p>
@@ -6048,7 +6048,7 @@
         <w:pStyle w:val="Heading3"/>
       </w:pPr>
       <w:r>
-        <w:t>Phép đối chiếu ba tập kết quả</w:t>
+        <w:t>Phép đối chiếu bốn tập kết quả</w:t>
       </w:r>
     </w:p>
     <w:p>
@@ -6056,7 +6056,7 @@
         <w:pStyle w:val="BodyText"/>
       </w:pPr>
       <w:r>
-        <w:t>Ba phép cộng độc lập trên các tệp CSV đều cho 156: tổng total_records theo đô thị = 52 + 52 + 52; tổng sample_count của 24 nhóm giờ = 156; tổng occurrence_count của các cấp AQI = 156. Log ghi 144 dòng backfill tương ứng 48 mốc giờ × 3 đô thị, cộng 4 lượt realtime trước lượt xuất Athena thành 156. Lượt realtime thứ năm sau đó làm tổng dòng được báo đã ghi tăng thêm 3. Các phép cộng xác nhận tính nhất quán của ba góc nhìn phân tích trong tập dữ liệu Tuần 1.</w:t>
+        <w:t>Tổng total_records theo đô thị là 52 + 52 + 52 = 156. Tổng sample_count của 24 nhóm giờ và tổng occurrence_count của các cấp AQI đều bằng 156. CSV gốc cũng có đúng 156 dòng và 156 record_id riêng biệt. Bốn phép kiểm tra số dòng độc lập cho thấy các bảng tổng hợp dùng cùng quy mô mẫu của lượt xuất Tuần 1.</w:t>
       </w:r>
     </w:p>
     <w:tbl>
@@ -6088,7 +6088,7 @@
                 <w:rFonts w:ascii="Consolas" w:hAnsi="Consolas"/>
                 <w:sz w:val="18"/>
               </w:rPr>
-              <w:t>48 giờ × 3 đô thị = 144 dòng backfill</w:t>
+              <w:t>52 + 52 + 52 = 156 dòng theo đô thị</w:t>
             </w:r>
             <w:r>
               <w:br/>
@@ -6098,7 +6098,7 @@
                 <w:rFonts w:ascii="Consolas" w:hAnsi="Consolas"/>
                 <w:sz w:val="18"/>
               </w:rPr>
-              <w:t>144 + (4 lượt realtime × 3 đô thị) = 156 dòng ở lượt xuất</w:t>
+              <w:t>Tổng 24 nhóm giờ = tổng các cấp AQI = 156</w:t>
             </w:r>
             <w:r>
               <w:br/>
@@ -6108,7 +6108,7 @@
                 <w:rFonts w:ascii="Consolas" w:hAnsi="Consolas"/>
                 <w:sz w:val="18"/>
               </w:rPr>
-              <w:t>156 + 3 dòng realtime sau đó = 159 dòng ghi theo log</w:t>
+              <w:t>CSV raw = 156 dòng, 156 record_id riêng biệt</w:t>
             </w:r>
           </w:p>
         </w:tc>
@@ -6382,7 +6382,7 @@
                 <w:rFonts w:ascii="Times New Roman" w:hAnsi="Times New Roman"/>
                 <w:sz w:val="20"/>
               </w:rPr>
-              <w:t>108,37</w:t>
+              <w:t>107,79</w:t>
             </w:r>
           </w:p>
         </w:tc>
@@ -6454,7 +6454,7 @@
                 <w:rFonts w:ascii="Times New Roman" w:hAnsi="Times New Roman"/>
                 <w:sz w:val="20"/>
               </w:rPr>
-              <w:t>38,10</w:t>
+              <w:t>37,03</w:t>
             </w:r>
           </w:p>
         </w:tc>
@@ -6531,7 +6531,7 @@
                 <w:rFonts w:ascii="Times New Roman" w:hAnsi="Times New Roman"/>
                 <w:sz w:val="20"/>
               </w:rPr>
-              <w:t>77,62</w:t>
+              <w:t>74,67</w:t>
             </w:r>
           </w:p>
         </w:tc>
@@ -6555,7 +6555,7 @@
                 <w:rFonts w:ascii="Times New Roman" w:hAnsi="Times New Roman"/>
                 <w:sz w:val="20"/>
               </w:rPr>
-              <w:t>41</w:t>
+              <w:t>36</w:t>
             </w:r>
           </w:p>
         </w:tc>
@@ -6603,7 +6603,7 @@
                 <w:rFonts w:ascii="Times New Roman" w:hAnsi="Times New Roman"/>
                 <w:sz w:val="20"/>
               </w:rPr>
-              <w:t>14,73</w:t>
+              <w:t>14,23</w:t>
             </w:r>
           </w:p>
         </w:tc>
@@ -6680,7 +6680,7 @@
                 <w:rFonts w:ascii="Times New Roman" w:hAnsi="Times New Roman"/>
                 <w:sz w:val="20"/>
               </w:rPr>
-              <w:t>67,96</w:t>
+              <w:t>67,56</w:t>
             </w:r>
           </w:p>
         </w:tc>
@@ -6752,7 +6752,7 @@
                 <w:rFonts w:ascii="Times New Roman" w:hAnsi="Times New Roman"/>
                 <w:sz w:val="20"/>
               </w:rPr>
-              <w:t>17,36</w:t>
+              <w:t>15,36</w:t>
             </w:r>
           </w:p>
         </w:tc>
@@ -6944,7 +6944,7 @@
                 <w:rFonts w:ascii="Times New Roman" w:hAnsi="Times New Roman"/>
                 <w:sz w:val="20"/>
               </w:rPr>
-              <w:t>38,34</w:t>
+              <w:t>37,35</w:t>
             </w:r>
           </w:p>
         </w:tc>
@@ -6968,7 +6968,7 @@
                 <w:rFonts w:ascii="Times New Roman" w:hAnsi="Times New Roman"/>
                 <w:sz w:val="20"/>
               </w:rPr>
-              <w:t>27,57</w:t>
+              <w:t>27,79</w:t>
             </w:r>
           </w:p>
         </w:tc>
@@ -6992,7 +6992,7 @@
                 <w:rFonts w:ascii="Times New Roman" w:hAnsi="Times New Roman"/>
                 <w:sz w:val="20"/>
               </w:rPr>
-              <w:t>85,79</w:t>
+              <w:t>84,71</w:t>
             </w:r>
           </w:p>
         </w:tc>
@@ -7045,7 +7045,7 @@
                 <w:rFonts w:ascii="Times New Roman" w:hAnsi="Times New Roman"/>
                 <w:sz w:val="20"/>
               </w:rPr>
-              <w:t>17,97</w:t>
+              <w:t>17,28</w:t>
             </w:r>
           </w:p>
         </w:tc>
@@ -7069,7 +7069,7 @@
                 <w:rFonts w:ascii="Times New Roman" w:hAnsi="Times New Roman"/>
                 <w:sz w:val="20"/>
               </w:rPr>
-              <w:t>28,79</w:t>
+              <w:t>28,85</w:t>
             </w:r>
           </w:p>
         </w:tc>
@@ -7093,7 +7093,7 @@
                 <w:rFonts w:ascii="Times New Roman" w:hAnsi="Times New Roman"/>
                 <w:sz w:val="20"/>
               </w:rPr>
-              <w:t>75,31</w:t>
+              <w:t>74,87</w:t>
             </w:r>
           </w:p>
         </w:tc>
@@ -7146,7 +7146,7 @@
                 <w:rFonts w:ascii="Times New Roman" w:hAnsi="Times New Roman"/>
                 <w:sz w:val="20"/>
               </w:rPr>
-              <w:t>18,14</w:t>
+              <w:t>16,11</w:t>
             </w:r>
           </w:p>
         </w:tc>
@@ -7170,7 +7170,7 @@
                 <w:rFonts w:ascii="Times New Roman" w:hAnsi="Times New Roman"/>
                 <w:sz w:val="20"/>
               </w:rPr>
-              <w:t>24,41</w:t>
+              <w:t>24,54</w:t>
             </w:r>
           </w:p>
         </w:tc>
@@ -7194,7 +7194,7 @@
                 <w:rFonts w:ascii="Times New Roman" w:hAnsi="Times New Roman"/>
                 <w:sz w:val="20"/>
               </w:rPr>
-              <w:t>77,94</w:t>
+              <w:t>76,65</w:t>
             </w:r>
           </w:p>
         </w:tc>
@@ -7260,7 +7260,7 @@
         <w:pStyle w:val="BodyText"/>
       </w:pPr>
       <w:r>
-        <w:t>Trong 52 mẫu của mỗi đô thị, TP. Hồ Chí Minh có AQI trung bình 108,37 và cực đại 172; Đà Nẵng lần lượt 77,62 và 155; Hà Nội 67,96 và 80. PM2.5 trung bình của TP. Hồ Chí Minh là 38,10 µg/m³, cao hơn Đà Nẵng 14,73 và Hà Nội 17,36 trong đúng tập dữ liệu này. Hình 4.1 được dựng lại từ CSV của truy vấn đã xác nhận, không phải số liệu giả định.</w:t>
+        <w:t>Trong 52 mẫu của mỗi đô thị, TP. Hồ Chí Minh có AQI trung bình 107,79 và cực đại 172; Đà Nẵng lần lượt 74,67 và 155; Hà Nội 67,56 và 80. PM2.5 trung bình của TP. Hồ Chí Minh là 37,03 µg/m³, so với 14,23 ở Đà Nẵng và 15,36 ở Hà Nội. Hình 4.1 được dựng từ CSV của cùng lượt truy vấn.</w:t>
       </w:r>
     </w:p>
     <w:p>
@@ -7268,7 +7268,7 @@
         <w:pStyle w:val="BodyText"/>
       </w:pPr>
       <w:r>
-        <w:t>Hiệu AQI trung bình giữa TP. Hồ Chí Minh và Đà Nẵng là 30,75 điểm; giữa TP. Hồ Chí Minh và Hà Nội là 40,41 điểm. Về PM2.5, tỷ số TP. Hồ Chí Minh/Đà Nẵng trong tập mẫu là khoảng 2,59, còn TP. Hồ Chí Minh/Hà Nội khoảng 2,19. Đây là so sánh mô tả của 52 dòng mỗi nơi, không phải ước lượng trung bình dài hạn cho ba thành phố. Giá trị AQI trung bình cũng không nên đồng nhất với phân loại của mọi giờ; Bảng 4.5 cho thấy phân bố từng cấp cụ thể.</w:t>
+        <w:t>Hiệu AQI trung bình giữa TP. Hồ Chí Minh và Đà Nẵng là 33,12 điểm; giữa TP. Hồ Chí Minh và Hà Nội là 40,23 điểm. Tỷ số PM2.5 tương ứng là 2,60 và 2,41. Đây là so sánh mô tả của 52 dòng mỗi nơi, không phải ước lượng dài hạn; Bảng 4.5 thể hiện phân bố từng cấp AQI.</w:t>
       </w:r>
     </w:p>
     <w:p>
@@ -7334,7 +7334,7 @@
         <w:pStyle w:val="BodyText"/>
       </w:pPr>
       <w:r>
-        <w:t>Truy vấn theo hour có đủ 24 nhóm từ 00 đến 23 UTC. AQI trung bình cao nhất tại 11 giờ (103,83) và thấp nhất tại 23 giờ (75,83). PM2.5 cao nhất tại 15 giờ (27,98 µg/m³) và thấp nhất tại 03 giờ (20,22 µg/m³). Đây là trung bình gộp ba đô thị; 23 nhóm có sáu mẫu nhưng giờ 15 có 18 mẫu do 12 dòng realtime cùng nằm trong nhóm đó. Vì vậy đỉnh PM2.5 ở giờ 15 chịu trọng số mẫu khác các giờ còn lại; biểu đồ không đủ để kết luận chu kỳ ô nhiễm điển hình của ngày.</w:t>
+        <w:t>Truy vấn theo hour có đủ 24 nhóm từ 00 đến 23 UTC. AQI trung bình cao nhất tại giờ 11 (103,83) và thấp nhất tại giờ 23 (75,83). PM2.5 cao nhất tại giờ 19 (25,53 µg/m³) và thấp nhất tại giờ 03 (18,03 µg/m³). Có 20 nhóm sáu mẫu và bốn nhóm chín mẫu; do cỡ mẫu không đều, đồ thị chỉ mô tả tập dữ liệu Tuần 1 và không đủ để suy ra chu kỳ ô nhiễm điển hình.</w:t>
       </w:r>
     </w:p>
     <w:p>
@@ -7545,7 +7545,7 @@
                 <w:rFonts w:ascii="Times New Roman" w:hAnsi="Times New Roman"/>
                 <w:sz w:val="20"/>
               </w:rPr>
-              <w:t>81,67</w:t>
+              <w:t>77,00</w:t>
             </w:r>
           </w:p>
         </w:tc>
@@ -7569,7 +7569,7 @@
                 <w:rFonts w:ascii="Times New Roman" w:hAnsi="Times New Roman"/>
                 <w:sz w:val="20"/>
               </w:rPr>
-              <w:t>26,00</w:t>
+              <w:t>22,81</w:t>
             </w:r>
           </w:p>
         </w:tc>
@@ -7593,7 +7593,7 @@
                 <w:rFonts w:ascii="Times New Roman" w:hAnsi="Times New Roman"/>
                 <w:sz w:val="20"/>
               </w:rPr>
-              <w:t>27,55</w:t>
+              <w:t>24,06</w:t>
             </w:r>
           </w:p>
         </w:tc>
@@ -7617,7 +7617,7 @@
                 <w:rFonts w:ascii="Times New Roman" w:hAnsi="Times New Roman"/>
                 <w:sz w:val="20"/>
               </w:rPr>
-              <w:t>6</w:t>
+              <w:t>9</w:t>
             </w:r>
           </w:p>
         </w:tc>
@@ -7670,7 +7670,7 @@
                 <w:rFonts w:ascii="Times New Roman" w:hAnsi="Times New Roman"/>
                 <w:sz w:val="20"/>
               </w:rPr>
-              <w:t>81,33</w:t>
+              <w:t>76,78</w:t>
             </w:r>
           </w:p>
         </w:tc>
@@ -7694,7 +7694,7 @@
                 <w:rFonts w:ascii="Times New Roman" w:hAnsi="Times New Roman"/>
                 <w:sz w:val="20"/>
               </w:rPr>
-              <w:t>25,03</w:t>
+              <w:t>22,09</w:t>
             </w:r>
           </w:p>
         </w:tc>
@@ -7718,7 +7718,7 @@
                 <w:rFonts w:ascii="Times New Roman" w:hAnsi="Times New Roman"/>
                 <w:sz w:val="20"/>
               </w:rPr>
-              <w:t>26,77</w:t>
+              <w:t>23,66</w:t>
             </w:r>
           </w:p>
         </w:tc>
@@ -7742,7 +7742,7 @@
                 <w:rFonts w:ascii="Times New Roman" w:hAnsi="Times New Roman"/>
                 <w:sz w:val="20"/>
               </w:rPr>
-              <w:t>6</w:t>
+              <w:t>9</w:t>
             </w:r>
           </w:p>
         </w:tc>
@@ -7795,7 +7795,7 @@
                 <w:rFonts w:ascii="Times New Roman" w:hAnsi="Times New Roman"/>
                 <w:sz w:val="20"/>
               </w:rPr>
-              <w:t>81,00</w:t>
+              <w:t>76,67</w:t>
             </w:r>
           </w:p>
         </w:tc>
@@ -7819,7 +7819,7 @@
                 <w:rFonts w:ascii="Times New Roman" w:hAnsi="Times New Roman"/>
                 <w:sz w:val="20"/>
               </w:rPr>
-              <w:t>21,05</w:t>
+              <w:t>18,87</w:t>
             </w:r>
           </w:p>
         </w:tc>
@@ -7843,7 +7843,7 @@
                 <w:rFonts w:ascii="Times New Roman" w:hAnsi="Times New Roman"/>
                 <w:sz w:val="20"/>
               </w:rPr>
-              <w:t>23,03</w:t>
+              <w:t>20,77</w:t>
             </w:r>
           </w:p>
         </w:tc>
@@ -7867,7 +7867,7 @@
                 <w:rFonts w:ascii="Times New Roman" w:hAnsi="Times New Roman"/>
                 <w:sz w:val="20"/>
               </w:rPr>
-              <w:t>6</w:t>
+              <w:t>9</w:t>
             </w:r>
           </w:p>
         </w:tc>
@@ -7920,7 +7920,7 @@
                 <w:rFonts w:ascii="Times New Roman" w:hAnsi="Times New Roman"/>
                 <w:sz w:val="20"/>
               </w:rPr>
-              <w:t>80,67</w:t>
+              <w:t>76,67</w:t>
             </w:r>
           </w:p>
         </w:tc>
@@ -7944,7 +7944,7 @@
                 <w:rFonts w:ascii="Times New Roman" w:hAnsi="Times New Roman"/>
                 <w:sz w:val="20"/>
               </w:rPr>
-              <w:t>20,22</w:t>
+              <w:t>18,03</w:t>
             </w:r>
           </w:p>
         </w:tc>
@@ -7968,7 +7968,7 @@
                 <w:rFonts w:ascii="Times New Roman" w:hAnsi="Times New Roman"/>
                 <w:sz w:val="20"/>
               </w:rPr>
-              <w:t>22,30</w:t>
+              <w:t>20,04</w:t>
             </w:r>
           </w:p>
         </w:tc>
@@ -7992,7 +7992,7 @@
                 <w:rFonts w:ascii="Times New Roman" w:hAnsi="Times New Roman"/>
                 <w:sz w:val="20"/>
               </w:rPr>
-              <w:t>6</w:t>
+              <w:t>9</w:t>
             </w:r>
           </w:p>
         </w:tc>
@@ -9420,7 +9420,7 @@
                 <w:rFonts w:ascii="Times New Roman" w:hAnsi="Times New Roman"/>
                 <w:sz w:val="20"/>
               </w:rPr>
-              <w:t>84,67</w:t>
+              <w:t>84,00</w:t>
             </w:r>
           </w:p>
         </w:tc>
@@ -9444,7 +9444,7 @@
                 <w:rFonts w:ascii="Times New Roman" w:hAnsi="Times New Roman"/>
                 <w:sz w:val="20"/>
               </w:rPr>
-              <w:t>27,98</w:t>
+              <w:t>22,60</w:t>
             </w:r>
           </w:p>
         </w:tc>
@@ -9468,7 +9468,7 @@
                 <w:rFonts w:ascii="Times New Roman" w:hAnsi="Times New Roman"/>
                 <w:sz w:val="20"/>
               </w:rPr>
-              <w:t>29,68</w:t>
+              <w:t>23,78</w:t>
             </w:r>
           </w:p>
         </w:tc>
@@ -9492,7 +9492,7 @@
                 <w:rFonts w:ascii="Times New Roman" w:hAnsi="Times New Roman"/>
                 <w:sz w:val="20"/>
               </w:rPr>
-              <w:t>18</w:t>
+              <w:t>6</w:t>
             </w:r>
           </w:p>
         </w:tc>
@@ -10894,7 +10894,7 @@
                 <w:rFonts w:ascii="Times New Roman" w:hAnsi="Times New Roman"/>
                 <w:sz w:val="20"/>
               </w:rPr>
-              <w:t>2 (3,8%)</w:t>
+              <w:t>6 (11,5%)</w:t>
             </w:r>
           </w:p>
         </w:tc>
@@ -10918,7 +10918,7 @@
                 <w:rFonts w:ascii="Times New Roman" w:hAnsi="Times New Roman"/>
                 <w:sz w:val="20"/>
               </w:rPr>
-              <w:t>43 (82,7%)</w:t>
+              <w:t>39 (75,0%)</w:t>
             </w:r>
           </w:p>
         </w:tc>
@@ -11107,7 +11107,7 @@
         <w:pStyle w:val="BodyText"/>
       </w:pPr>
       <w:r>
-        <w:t>TP. Hồ Chí Minh có 35/52 mẫu (67,3%) ở mức không tốt cho nhóm nhạy cảm và 4/52 mẫu (7,7%) ở mức kém; Hà Nội có 52/52 mẫu ở mức trung bình. Các tỷ lệ cộng lại có thể chênh 0,1 điểm phần trăm do làm tròn một chữ số thập phân.</w:t>
+        <w:t>TP. Hồ Chí Minh có 35/52 mẫu (67,3%) ở mức không tốt cho nhóm nhạy cảm và 4/52 mẫu (7,7%) ở mức kém. Đà Nẵng có 39/52 mẫu (75,0%) ở mức trung bình và 6/52 mẫu (11,5%) ở mức tốt; Hà Nội có 52/52 mẫu ở mức trung bình. Các tỷ lệ cộng lại có thể lệch 0,1 điểm phần trăm do làm tròn một chữ số thập phân.</w:t>
       </w:r>
     </w:p>
     <w:p>
@@ -11325,7 +11325,7 @@
                 <w:rFonts w:ascii="Times New Roman" w:hAnsi="Times New Roman"/>
                 <w:sz w:val="20"/>
               </w:rPr>
-              <w:t>TP. Hồ Chí Minh</w:t>
+              <w:t>Đà Nẵng</w:t>
             </w:r>
           </w:p>
         </w:tc>
@@ -11349,7 +11349,7 @@
                 <w:rFonts w:ascii="Times New Roman" w:hAnsi="Times New Roman"/>
                 <w:sz w:val="20"/>
               </w:rPr>
-              <w:t>-0,7105</w:t>
+              <w:t>0,4798</w:t>
             </w:r>
           </w:p>
         </w:tc>
@@ -11373,7 +11373,7 @@
                 <w:rFonts w:ascii="Times New Roman" w:hAnsi="Times New Roman"/>
                 <w:sz w:val="20"/>
               </w:rPr>
-              <w:t>0,6768</w:t>
+              <w:t>-0,3183</w:t>
             </w:r>
           </w:p>
         </w:tc>
@@ -11397,7 +11397,7 @@
                 <w:rFonts w:ascii="Times New Roman" w:hAnsi="Times New Roman"/>
                 <w:sz w:val="20"/>
               </w:rPr>
-              <w:t>-0,2117</w:t>
+              <w:t>-0,2291</w:t>
             </w:r>
           </w:p>
         </w:tc>
@@ -11426,7 +11426,7 @@
                 <w:rFonts w:ascii="Times New Roman" w:hAnsi="Times New Roman"/>
                 <w:sz w:val="20"/>
               </w:rPr>
-              <w:t>Đà Nẵng</w:t>
+              <w:t>Hà Nội</w:t>
             </w:r>
           </w:p>
         </w:tc>
@@ -11450,7 +11450,7 @@
                 <w:rFonts w:ascii="Times New Roman" w:hAnsi="Times New Roman"/>
                 <w:sz w:val="20"/>
               </w:rPr>
-              <w:t>0,4274</w:t>
+              <w:t>0,6462</w:t>
             </w:r>
           </w:p>
         </w:tc>
@@ -11474,7 +11474,7 @@
                 <w:rFonts w:ascii="Times New Roman" w:hAnsi="Times New Roman"/>
                 <w:sz w:val="20"/>
               </w:rPr>
-              <w:t>-0,2790</w:t>
+              <w:t>0,2486</w:t>
             </w:r>
           </w:p>
         </w:tc>
@@ -11498,7 +11498,7 @@
                 <w:rFonts w:ascii="Times New Roman" w:hAnsi="Times New Roman"/>
                 <w:sz w:val="20"/>
               </w:rPr>
-              <w:t>-0,2810</w:t>
+              <w:t>-0,4846</w:t>
             </w:r>
           </w:p>
         </w:tc>
@@ -11527,7 +11527,7 @@
                 <w:rFonts w:ascii="Times New Roman" w:hAnsi="Times New Roman"/>
                 <w:sz w:val="20"/>
               </w:rPr>
-              <w:t>Hà Nội</w:t>
+              <w:t>TP. Hồ Chí Minh</w:t>
             </w:r>
           </w:p>
         </w:tc>
@@ -11551,7 +11551,7 @@
                 <w:rFonts w:ascii="Times New Roman" w:hAnsi="Times New Roman"/>
                 <w:sz w:val="20"/>
               </w:rPr>
-              <w:t>0,1929</w:t>
+              <w:t>-0,6977</w:t>
             </w:r>
           </w:p>
         </w:tc>
@@ -11575,7 +11575,7 @@
                 <w:rFonts w:ascii="Times New Roman" w:hAnsi="Times New Roman"/>
                 <w:sz w:val="20"/>
               </w:rPr>
-              <w:t>0,0094</w:t>
+              <w:t>0,6627</w:t>
             </w:r>
           </w:p>
         </w:tc>
@@ -11599,7 +11599,7 @@
                 <w:rFonts w:ascii="Times New Roman" w:hAnsi="Times New Roman"/>
                 <w:sz w:val="20"/>
               </w:rPr>
-              <w:t>-0,7084</w:t>
+              <w:t>-0,1536</w:t>
             </w:r>
           </w:p>
         </w:tc>
@@ -11615,7 +11615,7 @@
         <w:pStyle w:val="BodyText"/>
       </w:pPr>
       <w:r>
-        <w:t>TP. Hồ Chí Minh có r(nhiệt độ, PM2.5) = −0,7105 và r(độ ẩm, PM2.5) = 0,6768; Hà Nội có r(tốc độ gió, PM2.5) = −0,7084. Đây là tương quan mô tả trong 52 mẫu mỗi đô thị; mẫu ngắn và các giờ liền kề có thể phụ thuộc nhau. Không thể suy ra quan hệ nhân quả hay xu hướng dài hạn từ các hệ số này.</w:t>
+        <w:t>TP. Hồ Chí Minh có r(nhiệt độ, PM2.5) = -0,6977 và r(độ ẩm, PM2.5) = 0,6627; Hà Nội có r(tốc độ gió, PM2.5) = -0,4846. Đây là tương quan mô tả trong 52 mẫu mỗi đô thị; mẫu ngắn và các giờ liền kề có thể phụ thuộc nhau. Không thể suy ra quan hệ nhân quả hay xu hướng dài hạn từ các hệ số này.</w:t>
       </w:r>
     </w:p>
     <w:p>
@@ -11623,7 +11623,7 @@
         <w:pStyle w:val="Heading2"/>
       </w:pPr>
       <w:r>
-        <w:t>4.6 Thời gian và dung lượng quét của bốn truy vấn</w:t>
+        <w:t>4.6 Thời gian và dung lượng quét của năm truy vấn</w:t>
       </w:r>
     </w:p>
     <w:p>
@@ -11882,7 +11882,7 @@
                 <w:rFonts w:ascii="Times New Roman" w:hAnsi="Times New Roman"/>
                 <w:sz w:val="20"/>
               </w:rPr>
-              <w:t>749 ms</w:t>
+              <w:t>872 ms</w:t>
             </w:r>
           </w:p>
         </w:tc>
@@ -11906,7 +11906,7 @@
                 <w:rFonts w:ascii="Times New Roman" w:hAnsi="Times New Roman"/>
                 <w:sz w:val="20"/>
               </w:rPr>
-              <w:t>87.551</w:t>
+              <w:t>87.250</w:t>
             </w:r>
           </w:p>
         </w:tc>
@@ -12007,7 +12007,7 @@
                 <w:rFonts w:ascii="Times New Roman" w:hAnsi="Times New Roman"/>
                 <w:sz w:val="20"/>
               </w:rPr>
-              <w:t>1065 ms</w:t>
+              <w:t>748 ms</w:t>
             </w:r>
           </w:p>
         </w:tc>
@@ -12031,7 +12031,7 @@
                 <w:rFonts w:ascii="Times New Roman" w:hAnsi="Times New Roman"/>
                 <w:sz w:val="20"/>
               </w:rPr>
-              <w:t>87.551</w:t>
+              <w:t>87.250</w:t>
             </w:r>
           </w:p>
         </w:tc>
@@ -12132,7 +12132,7 @@
                 <w:rFonts w:ascii="Times New Roman" w:hAnsi="Times New Roman"/>
                 <w:sz w:val="20"/>
               </w:rPr>
-              <w:t>872 ms</w:t>
+              <w:t>836 ms</w:t>
             </w:r>
           </w:p>
         </w:tc>
@@ -12156,7 +12156,7 @@
                 <w:rFonts w:ascii="Times New Roman" w:hAnsi="Times New Roman"/>
                 <w:sz w:val="20"/>
               </w:rPr>
-              <w:t>87.551</w:t>
+              <w:t>87.250</w:t>
             </w:r>
           </w:p>
         </w:tc>
@@ -12257,7 +12257,7 @@
                 <w:rFonts w:ascii="Times New Roman" w:hAnsi="Times New Roman"/>
                 <w:sz w:val="20"/>
               </w:rPr>
-              <w:t>747 ms</w:t>
+              <w:t>777 ms</w:t>
             </w:r>
           </w:p>
         </w:tc>
@@ -12281,7 +12281,132 @@
                 <w:rFonts w:ascii="Times New Roman" w:hAnsi="Times New Roman"/>
                 <w:sz w:val="20"/>
               </w:rPr>
-              <w:t>87.551</w:t>
+              <w:t>87.250</w:t>
+            </w:r>
+          </w:p>
+        </w:tc>
+      </w:tr>
+      <w:tr>
+        <w:trPr>
+          <w:cantSplit/>
+        </w:trPr>
+        <w:tc>
+          <w:tcPr>
+            <w:tcW w:type="dxa" w:w="3168"/>
+            <w:vAlign w:val="center"/>
+            <w:tcBorders>
+              <w:top w:val="single" w:sz="4" w:color="B4B4B4"/>
+              <w:left w:val="single" w:sz="4" w:color="B4B4B4"/>
+              <w:bottom w:val="single" w:sz="4" w:color="B4B4B4"/>
+              <w:right w:val="single" w:sz="4" w:color="B4B4B4"/>
+            </w:tcBorders>
+          </w:tcPr>
+          <w:p>
+            <w:pPr>
+              <w:spacing w:after="40" w:before="40"/>
+            </w:pPr>
+            <w:r>
+              <w:rPr>
+                <w:rFonts w:ascii="Times New Roman" w:hAnsi="Times New Roman"/>
+                <w:sz w:val="20"/>
+              </w:rPr>
+              <w:t>raw weather aqi records</w:t>
+            </w:r>
+          </w:p>
+        </w:tc>
+        <w:tc>
+          <w:tcPr>
+            <w:tcW w:type="dxa" w:w="1584"/>
+            <w:vAlign w:val="center"/>
+            <w:tcBorders>
+              <w:top w:val="single" w:sz="4" w:color="B4B4B4"/>
+              <w:left w:val="single" w:sz="4" w:color="B4B4B4"/>
+              <w:bottom w:val="single" w:sz="4" w:color="B4B4B4"/>
+              <w:right w:val="single" w:sz="4" w:color="B4B4B4"/>
+            </w:tcBorders>
+          </w:tcPr>
+          <w:p>
+            <w:pPr>
+              <w:spacing w:after="40" w:before="40"/>
+            </w:pPr>
+            <w:r>
+              <w:rPr>
+                <w:rFonts w:ascii="Times New Roman" w:hAnsi="Times New Roman"/>
+                <w:sz w:val="20"/>
+              </w:rPr>
+              <w:t>SUCCEEDED</w:t>
+            </w:r>
+          </w:p>
+        </w:tc>
+        <w:tc>
+          <w:tcPr>
+            <w:tcW w:type="dxa" w:w="1080"/>
+            <w:vAlign w:val="center"/>
+            <w:tcBorders>
+              <w:top w:val="single" w:sz="4" w:color="B4B4B4"/>
+              <w:left w:val="single" w:sz="4" w:color="B4B4B4"/>
+              <w:bottom w:val="single" w:sz="4" w:color="B4B4B4"/>
+              <w:right w:val="single" w:sz="4" w:color="B4B4B4"/>
+            </w:tcBorders>
+          </w:tcPr>
+          <w:p>
+            <w:pPr>
+              <w:spacing w:after="40" w:before="40"/>
+            </w:pPr>
+            <w:r>
+              <w:rPr>
+                <w:rFonts w:ascii="Times New Roman" w:hAnsi="Times New Roman"/>
+                <w:sz w:val="20"/>
+              </w:rPr>
+              <w:t>156</w:t>
+            </w:r>
+          </w:p>
+        </w:tc>
+        <w:tc>
+          <w:tcPr>
+            <w:tcW w:type="dxa" w:w="1512"/>
+            <w:vAlign w:val="center"/>
+            <w:tcBorders>
+              <w:top w:val="single" w:sz="4" w:color="B4B4B4"/>
+              <w:left w:val="single" w:sz="4" w:color="B4B4B4"/>
+              <w:bottom w:val="single" w:sz="4" w:color="B4B4B4"/>
+              <w:right w:val="single" w:sz="4" w:color="B4B4B4"/>
+            </w:tcBorders>
+          </w:tcPr>
+          <w:p>
+            <w:pPr>
+              <w:spacing w:after="40" w:before="40"/>
+            </w:pPr>
+            <w:r>
+              <w:rPr>
+                <w:rFonts w:ascii="Times New Roman" w:hAnsi="Times New Roman"/>
+                <w:sz w:val="20"/>
+              </w:rPr>
+              <w:t>766 ms</w:t>
+            </w:r>
+          </w:p>
+        </w:tc>
+        <w:tc>
+          <w:tcPr>
+            <w:tcW w:type="dxa" w:w="1944"/>
+            <w:vAlign w:val="center"/>
+            <w:tcBorders>
+              <w:top w:val="single" w:sz="4" w:color="B4B4B4"/>
+              <w:left w:val="single" w:sz="4" w:color="B4B4B4"/>
+              <w:bottom w:val="single" w:sz="4" w:color="B4B4B4"/>
+              <w:right w:val="single" w:sz="4" w:color="B4B4B4"/>
+            </w:tcBorders>
+          </w:tcPr>
+          <w:p>
+            <w:pPr>
+              <w:spacing w:after="40" w:before="40"/>
+            </w:pPr>
+            <w:r>
+              <w:rPr>
+                <w:rFonts w:ascii="Times New Roman" w:hAnsi="Times New Roman"/>
+                <w:sz w:val="20"/>
+              </w:rPr>
+              <w:t>87.250</w:t>
             </w:r>
           </w:p>
         </w:tc>
@@ -12314,7 +12439,7 @@
         <w:pStyle w:val="BodyText"/>
       </w:pPr>
       <w:r>
-        <w:t>Pipeline gồm các khối thu thập, lưu trữ, lập catalog, truy vấn, trực quan hóa, cảnh báo và giám sát. Trong Tuần 1, Lambda Active và lịch EventBridge Enabled; CloudWatch ghi sáu lượt gọi. S3 có bảy tệp raw với tổng 89.267 byte, Glue có ba phân vùng dữ liệu, còn bốn truy vấn Athena đều SUCCEEDED. Tập CSV xuất có 156 dòng để phân tích AQI, bụi mịn và tương quan khí tượng. SNS ghi nhận 10 MessageId Publish; Alarm ở trạng thái INSUFFICIENT_DATA. Các chỉ số này mô tả những lượt quan sát đã nêu trong báo cáo.</w:t>
+        <w:t>Pipeline gồm các khối thu thập, lưu trữ, lập catalog, truy vấn, trực quan hóa, cảnh báo và giám sát. Trong Tuần 1, Lambda Active và lịch EventBridge Enabled; CloudWatch ghi bốn lượt gọi và không ghi lỗi. S3 có ba tệp raw với tổng 87.250 byte, Glue có ba phân vùng dữ liệu, còn năm truy vấn Athena đều SUCCEEDED. Tập CSV gốc có 156 dòng để phân tích AQI, bụi mịn và tương quan khí tượng. Log ghi sáu MessageId riêng biệt; Alarm ở trạng thái INSUFFICIENT_DATA.</w:t>
       </w:r>
     </w:p>
     <w:p>
@@ -12487,7 +12612,7 @@
                 <w:rFonts w:ascii="Times New Roman" w:hAnsi="Times New Roman"/>
                 <w:sz w:val="20"/>
               </w:rPr>
-              <w:t>7 tệp raw; 89.267 byte</w:t>
+              <w:t>3 tệp raw; 87.250 byte</w:t>
             </w:r>
           </w:p>
         </w:tc>
@@ -12564,7 +12689,7 @@
                 <w:rFonts w:ascii="Times New Roman" w:hAnsi="Times New Roman"/>
                 <w:sz w:val="20"/>
               </w:rPr>
-              <w:t>6 lượt gọi</w:t>
+              <w:t>4 lượt gọi, 0 lỗi</w:t>
             </w:r>
           </w:p>
         </w:tc>
@@ -12588,7 +12713,7 @@
                 <w:rFonts w:ascii="Times New Roman" w:hAnsi="Times New Roman"/>
                 <w:sz w:val="20"/>
               </w:rPr>
-              <w:t>Metric Invocations tại hai khung giờ được đọc</w:t>
+              <w:t>CloudWatch Invocations và Errors</w:t>
             </w:r>
           </w:p>
         </w:tc>
@@ -12641,7 +12766,7 @@
                 <w:rFonts w:ascii="Times New Roman" w:hAnsi="Times New Roman"/>
                 <w:sz w:val="20"/>
               </w:rPr>
-              <w:t>10 MessageId</w:t>
+              <w:t>6 MessageId</w:t>
             </w:r>
           </w:p>
         </w:tc>
@@ -12718,7 +12843,7 @@
                 <w:rFonts w:ascii="Times New Roman" w:hAnsi="Times New Roman"/>
                 <w:sz w:val="20"/>
               </w:rPr>
-              <w:t>4 × 87.551 = 350.204 byte quét</w:t>
+              <w:t>5 × 87.250 = 436.250 byte quét</w:t>
             </w:r>
           </w:p>
         </w:tc>
@@ -12742,7 +12867,7 @@
                 <w:rFonts w:ascii="Times New Roman" w:hAnsi="Times New Roman"/>
                 <w:sz w:val="20"/>
               </w:rPr>
-              <w:t>QueryExecution của bốn truy vấn</w:t>
+              <w:t>QueryExecution của năm truy vấn</w:t>
             </w:r>
           </w:p>
         </w:tc>
@@ -12851,7 +12976,7 @@
         <w:pStyle w:val="BodyText"/>
       </w:pPr>
       <w:r>
-        <w:t>Trong Tuần 1, lượt xuất Athena có 156 bản ghi, bốn truy vấn thành công và bốn biểu đồ từ CSV. Phân công của chúng em được trình bày ở Bảng 2.1. AI hỗ trợ tra cứu, biên tập và dàn trang; số liệu được tổng hợp từ CSV và các kết quả quan sát AWS nêu trên.</w:t>
+        <w:t>Trong Tuần 1, lượt xuất Athena có 156 bản ghi gốc, năm truy vấn thành công và bốn biểu đồ từ CSV. Phân công của chúng em được trình bày ở Bảng 2.1. Nhóm chỉ dùng AI để tra cứu tài liệu; hai sinh viên thực hiện triển khai và phân tích số liệu theo phân công đã nêu.</w:t>
       </w:r>
     </w:p>
     <w:sectPr>

</xml_diff>

<commit_message>
fix(pipeline): fix CloudWatch alarm dimension, dashboard JSON encoding, and update Athena CLI logs with latest query IDs
</commit_message>
<xml_diff>
--- a/docs/Bao_cao_tuan_1_Dien_toan_dam_may_Nhom_05.docx
+++ b/docs/Bao_cao_tuan_1_Dien_toan_dam_may_Nhom_05.docx
@@ -11126,7 +11126,7 @@
       <w:r>
         <w:drawing>
           <wp:inline xmlns:a="http://schemas.openxmlformats.org/drawingml/2006/main" xmlns:pic="http://schemas.openxmlformats.org/drawingml/2006/picture">
-            <wp:extent cx="5577840" cy="2982649"/>
+            <wp:extent cx="5120640" cy="2738169"/>
             <wp:docPr id="6" name="Picture 6"/>
             <wp:cNvGraphicFramePr>
               <a:graphicFrameLocks noChangeAspect="1"/>
@@ -11147,7 +11147,7 @@
                   <pic:spPr>
                     <a:xfrm>
                       <a:off x="0" y="0"/>
-                      <a:ext cx="5577840" cy="2982649"/>
+                      <a:ext cx="5120640" cy="2738169"/>
                     </a:xfrm>
                     <a:prstGeom prst="rect"/>
                   </pic:spPr>
@@ -11325,7 +11325,7 @@
                 <w:rFonts w:ascii="Times New Roman" w:hAnsi="Times New Roman"/>
                 <w:sz w:val="20"/>
               </w:rPr>
-              <w:t>Đà Nẵng</w:t>
+              <w:t>Hà Nội</w:t>
             </w:r>
           </w:p>
         </w:tc>
@@ -11349,7 +11349,7 @@
                 <w:rFonts w:ascii="Times New Roman" w:hAnsi="Times New Roman"/>
                 <w:sz w:val="20"/>
               </w:rPr>
-              <w:t>0,4798</w:t>
+              <w:t>0,6462</w:t>
             </w:r>
           </w:p>
         </w:tc>
@@ -11373,7 +11373,7 @@
                 <w:rFonts w:ascii="Times New Roman" w:hAnsi="Times New Roman"/>
                 <w:sz w:val="20"/>
               </w:rPr>
-              <w:t>-0,3183</w:t>
+              <w:t>0,2486</w:t>
             </w:r>
           </w:p>
         </w:tc>
@@ -11397,7 +11397,7 @@
                 <w:rFonts w:ascii="Times New Roman" w:hAnsi="Times New Roman"/>
                 <w:sz w:val="20"/>
               </w:rPr>
-              <w:t>-0,2291</w:t>
+              <w:t>-0,4846</w:t>
             </w:r>
           </w:p>
         </w:tc>
@@ -11426,7 +11426,7 @@
                 <w:rFonts w:ascii="Times New Roman" w:hAnsi="Times New Roman"/>
                 <w:sz w:val="20"/>
               </w:rPr>
-              <w:t>Hà Nội</w:t>
+              <w:t>Đà Nẵng</w:t>
             </w:r>
           </w:p>
         </w:tc>
@@ -11450,7 +11450,7 @@
                 <w:rFonts w:ascii="Times New Roman" w:hAnsi="Times New Roman"/>
                 <w:sz w:val="20"/>
               </w:rPr>
-              <w:t>0,6462</w:t>
+              <w:t>0,4798</w:t>
             </w:r>
           </w:p>
         </w:tc>
@@ -11474,7 +11474,7 @@
                 <w:rFonts w:ascii="Times New Roman" w:hAnsi="Times New Roman"/>
                 <w:sz w:val="20"/>
               </w:rPr>
-              <w:t>0,2486</w:t>
+              <w:t>-0,3183</w:t>
             </w:r>
           </w:p>
         </w:tc>
@@ -11498,7 +11498,7 @@
                 <w:rFonts w:ascii="Times New Roman" w:hAnsi="Times New Roman"/>
                 <w:sz w:val="20"/>
               </w:rPr>
-              <w:t>-0,4846</w:t>
+              <w:t>-0,2291</w:t>
             </w:r>
           </w:p>
         </w:tc>
@@ -11615,7 +11615,7 @@
         <w:pStyle w:val="BodyText"/>
       </w:pPr>
       <w:r>
-        <w:t>TP. Hồ Chí Minh có r(nhiệt độ, PM2.5) = -0,6977 và r(độ ẩm, PM2.5) = 0,6627; Hà Nội có r(tốc độ gió, PM2.5) = -0,4846. Đây là tương quan mô tả trong 52 mẫu mỗi đô thị; mẫu ngắn và các giờ liền kề có thể phụ thuộc nhau. Không thể suy ra quan hệ nhân quả hay xu hướng dài hạn từ các hệ số này.</w:t>
+        <w:t>Tại TP. Hồ Chí Minh, r(nhiệt độ, PM2.5) = -0,6977 và r(độ ẩm, PM2.5) = 0,6627; ở Hà Nội, r(tốc độ gió, PM2.5) = -0,4846. Các hệ số mô tả 52 mẫu mỗi đô thị, không chứng minh quan hệ nhân quả.</w:t>
       </w:r>
     </w:p>
     <w:p>
@@ -11882,7 +11882,7 @@
                 <w:rFonts w:ascii="Times New Roman" w:hAnsi="Times New Roman"/>
                 <w:sz w:val="20"/>
               </w:rPr>
-              <w:t>872 ms</w:t>
+              <w:t>744 ms</w:t>
             </w:r>
           </w:p>
         </w:tc>
@@ -12007,7 +12007,7 @@
                 <w:rFonts w:ascii="Times New Roman" w:hAnsi="Times New Roman"/>
                 <w:sz w:val="20"/>
               </w:rPr>
-              <w:t>748 ms</w:t>
+              <w:t>936 ms</w:t>
             </w:r>
           </w:p>
         </w:tc>
@@ -12132,7 +12132,7 @@
                 <w:rFonts w:ascii="Times New Roman" w:hAnsi="Times New Roman"/>
                 <w:sz w:val="20"/>
               </w:rPr>
-              <w:t>836 ms</w:t>
+              <w:t>776 ms</w:t>
             </w:r>
           </w:p>
         </w:tc>
@@ -12257,7 +12257,7 @@
                 <w:rFonts w:ascii="Times New Roman" w:hAnsi="Times New Roman"/>
                 <w:sz w:val="20"/>
               </w:rPr>
-              <w:t>777 ms</w:t>
+              <w:t>930 ms</w:t>
             </w:r>
           </w:p>
         </w:tc>
@@ -12382,7 +12382,7 @@
                 <w:rFonts w:ascii="Times New Roman" w:hAnsi="Times New Roman"/>
                 <w:sz w:val="20"/>
               </w:rPr>
-              <w:t>766 ms</w:t>
+              <w:t>1192 ms</w:t>
             </w:r>
           </w:p>
         </w:tc>

</xml_diff>